<commit_message>
docs: actualizacion de documento maestro PPI bajo Normas APA 7ma edicion
</commit_message>
<xml_diff>
--- a/PPI_Cuarto_Semestre_RPA_LAD6819_MASTER.docx
+++ b/PPI_Cuarto_Semestre_RPA_LAD6819_MASTER.docx
@@ -160,6 +160,7 @@
     </w:p>
     <w:p>
       <w:pPr>
+        <w:spacing w:line="360" w:lineRule="auto"/>
         <w:jc w:val="center"/>
         <w:rPr>
           <w:rFonts w:cs="Times New Roman"/>
@@ -168,6 +169,11 @@
         </w:rPr>
       </w:pPr>
       <w:r>
+        <w:rPr>
+          <w:rFonts w:ascii="Arial" w:hAnsi="Arial"/>
+          <w:b/>
+          <w:sz w:val="28"/>
+        </w:rPr>
         <w:t>SISTEMA WEB RPA LAD-6819 PARA LA AUTOMATIZACIÓN, VALIDACIÓN Y ORQUESTACIÓN DE DESCUENTOS DE NÓMINA</w:t>
       </w:r>
     </w:p>
@@ -299,7 +305,11 @@
         </w:rPr>
       </w:pPr>
       <w:r>
-        <w:t>WILMER JOSÉ VEGA ACEVEDO (Líder / Administrador)</w:t>
+        <w:rPr>
+          <w:rFonts w:ascii="Arial" w:hAnsi="Arial"/>
+          <w:sz w:val="22"/>
+        </w:rPr>
+        <w:t>Wilmer José Vega Acevedo (Líder / Administrador)</w:t>
       </w:r>
     </w:p>
     <w:p>
@@ -312,7 +322,11 @@
         </w:rPr>
       </w:pPr>
       <w:r>
-        <w:t>DANILO ORTIZ CAMPILLO (Supervisor de Calidad)</w:t>
+        <w:rPr>
+          <w:rFonts w:ascii="Arial" w:hAnsi="Arial"/>
+          <w:sz w:val="22"/>
+        </w:rPr>
+        <w:t>Danilo Ortiz Campillo (Supervisor de Calidad)</w:t>
       </w:r>
     </w:p>
     <w:p>
@@ -325,7 +339,11 @@
         </w:rPr>
       </w:pPr>
       <w:r>
-        <w:t>JUAN ESTEBAN SANTANA SANTANA (Analista de Nómina)</w:t>
+        <w:rPr>
+          <w:rFonts w:ascii="Arial" w:hAnsi="Arial"/>
+          <w:sz w:val="22"/>
+        </w:rPr>
+        <w:t>Juan Esteban Santana Santana (Analista de Nómina)</w:t>
       </w:r>
     </w:p>
     <w:p>
@@ -561,7 +579,7 @@
           <w:headerReference w:type="default" r:id="rId8"/>
           <w:footerReference w:type="default" r:id="rId9"/>
           <w:pgSz w:w="11906" w:h="16838"/>
-          <w:pgMar w:top="1474" w:right="1134" w:bottom="1134" w:left="1701" w:header="1134" w:footer="720" w:gutter="0"/>
+          <w:pgMar w:top="1440" w:right="1440" w:bottom="1440" w:left="1440" w:header="1134" w:footer="720" w:gutter="0"/>
           <w:cols w:space="720"/>
         </w:sectPr>
       </w:pPr>
@@ -1403,17 +1421,24 @@
         <w:widowControl/>
         <w:suppressAutoHyphens w:val="0"/>
         <w:autoSpaceDN/>
-        <w:spacing w:line="276" w:lineRule="auto" w:after="120"/>
+        <w:spacing w:line="360" w:lineRule="auto" w:after="120" w:before="0"/>
+        <w:ind w:firstLine="0"/>
+        <w:jc w:val="both"/>
         <w:textAlignment w:val="auto"/>
         <w:rPr>
           <w:rFonts w:cs="Times New Roman"/>
         </w:rPr>
       </w:pPr>
       <w:r>
+        <w:rPr>
+          <w:rFonts w:ascii="Arial" w:hAnsi="Arial"/>
+          <w:color w:val="1E1E1E"/>
+          <w:sz w:val="22"/>
+        </w:rPr>
         <w:t>El presente informe técnico documenta el diseño, desarrollo e implementación del Sistema Web RPA LAD-6819, una solución orientada a la automatización, validación paramétrica y orquestación integral del proceso de deducciones de nómina para la compañía Blacksmith Research Colombia S.A.S. La organización actúa como entidad centralizadora y canalizadora de pólizas colectivas (Seguro de Vida, Gastos Médicos Mayores - GMM y Costos Administrativos) para destacadas firmas aliadas como Continental Gold, Compañía de Financiamiento CDF y DXC Technology.</w:t>
         <w:br/>
         <w:br/>
-        <w:t>En concordancia con los avances académicos de la Ingeniería en Software del cuarto semestre y las exigencias de escalabilidad operativa, la solución experimentó una evolución arquitectónica radical: se abandonó la anterior estructura desacoplada con backend en Python (FastAPI/Pandas) para consolidar un sistema Fullstack moderno sobre Next.js 14 con App Router y TypeScript, respaldado en la nube por Google Firebase (Firestore y Authentication). Esta transformación suprime los costos de infraestructura en servidores pesados, permite el procesamiento masivo en el navegador del cliente en milisegundos mediante la biblioteca SheetJS y proporciona una experiencia reactiva con Control de Acceso Basado en Roles (RBAC), registro dinámico de reglas empresariales y liquidación transaccional de pagos únicos.</w:t>
+        <w:t>En concordancia con los estándares de ingeniería de software propuestos por Pressman y Maxim (2020) y los requerimientos académicos del cuarto semestre, la solución experimentó una evolución arquitectónica radical: se sustituyó la anterior estructura desacoplada con backend en Python (FastAPI/Pandas) para consolidar un sistema Fullstack moderno sobre Next.js 14 con App Router y TypeScript (Vercel, 2024), respaldado en la nube por Google Firebase (Google Cloud, 2024). Esta transformación suprime los costos de infraestructura en servidores pesados, permite el procesamiento masivo en el navegador del cliente en milisegundos mediante la biblioteca SheetJS y proporciona una experiencia reactiva con Control de Acceso Basado en Roles (RBAC), registro dinámico de reglas empresariales y liquidación transaccional de pagos únicos.</w:t>
       </w:r>
     </w:p>
     <w:p>
@@ -3311,16 +3336,23 @@
     <w:p>
       <w:pPr>
         <w:pStyle w:val="Textbody"/>
-        <w:spacing w:line="276" w:lineRule="auto" w:after="120"/>
-        <w:rPr>
-          <w:rFonts w:ascii="Times New Roman" w:hAnsi="Times New Roman" w:cs="Times New Roman"/>
-        </w:rPr>
-      </w:pPr>
-      <w:r>
-        <w:t>Actualmente, la gestión y liquidación periódica de los descuentos de nómina en Blacksmith Research Colombia S.A.S. se enfrenta a un cuello de botella crítico generado por la manipulación manual de múltiples archivos de hojas de cálculo descargados de forma heterogénea por cada empresa aliada. Debido a la dispersión estructural de estos insumos (variación en nombres de encabezados, formatos de fecha, tipología de documentos de identidad y delimitadores numéricos), el equipo de analistas de nómina invierte más de 48 horas continuas por corte en tareas mecánicas de transcripción, búsqueda y validación de vigencias.</w:t>
+        <w:spacing w:line="360" w:lineRule="auto" w:after="120" w:before="0"/>
+        <w:ind w:firstLine="0"/>
+        <w:jc w:val="both"/>
+        <w:rPr>
+          <w:rFonts w:ascii="Times New Roman" w:hAnsi="Times New Roman" w:cs="Times New Roman"/>
+        </w:rPr>
+      </w:pPr>
+      <w:r>
+        <w:rPr>
+          <w:rFonts w:ascii="Arial" w:hAnsi="Arial"/>
+          <w:color w:val="1E1E1E"/>
+          <w:sz w:val="22"/>
+        </w:rPr>
+        <w:t>En palabras de Huare Inacio et al. (2022), la estructuración adecuada de un problema de ingeniería requiere articular con precisión las causas generadoras y los efectos críticos identificados en el contexto organizacional delimitado. En Blacksmith Research Colombia S.A.S., la gestión y liquidación periódica de los descuentos de nómina para empresas aliadas se enfrentaba a un cuello de botella crítico originado por la manipulación manual de múltiples archivos de hojas de cálculo heterogéneas enviadas por cada aliado corporativo.</w:t>
         <w:br/>
         <w:br/>
-        <w:t>Esta operación descentralizada acarrea graves efectos adversos: alta propensión a errores humanos de digitación, aplicación inexacta de porcentajes acordados, omisión inadvertida de topes máximos de descuento por colaborador (generando sobregiros que vulneran la normativa laboral colombiana) y ausencia de un mecanismo de control doble o auditoría en tiempo real. Adicionalmente, cualquier inconsistencia no detectada oportunamente desencadena reclamos salariales por parte de los empleados de los clientes corporativos, afectando la reputación institucional y acarreando reprocesos contables.</w:t>
+        <w:t>Debido a la dispersión estructural de estos insumos (variación en nombres de columnas, formatos de fecha, tipología de documentos de identidad y delimitadores numéricos), los analistas de nómina invertían más de 48 horas continuas por corte en tareas mecánicas de transcripción, búsqueda y validación de vigencias. Esta operación acarreaba graves efectos: alta propensión a errores humanos de digitación, aplicación inexacta de porcentajes acordados, omisión inadvertida de topes máximos de descuento por colaborador (generando sobregiros que vulneran la normativa laboral colombiana) y ausencia de auditoría digital en tiempo real.</w:t>
       </w:r>
     </w:p>
     <w:p>
@@ -3383,13 +3415,20 @@
     <w:p>
       <w:pPr>
         <w:pStyle w:val="Textbody"/>
-        <w:spacing w:line="276" w:lineRule="auto" w:after="120"/>
-        <w:rPr>
-          <w:rFonts w:ascii="Times New Roman" w:hAnsi="Times New Roman" w:cs="Times New Roman"/>
-        </w:rPr>
-      </w:pPr>
-      <w:r>
-        <w:t>Blacksmith Research Colombia S.A.S. es una firma de consultoría estratégica y desarrollo de soluciones de base tecnológica con sede principal en la ciudad de Medellín. Dentro de su portafolio B2B de optimización de procesos corporativos, la compañía opera como el intermediario y gestor central de convenios de bienestar laboral y seguros corporativos para grandes aliados empresariales. Entre sus principales aliados estratégicos se destacan Continental Gold (sector minero a gran escala), Compañía de Financiamiento CDF (sector bancario y servicios financieros) y DXC Technology (sector global de tecnologías de la información).</w:t>
+        <w:spacing w:line="360" w:lineRule="auto" w:after="120" w:before="0"/>
+        <w:ind w:firstLine="0"/>
+        <w:jc w:val="both"/>
+        <w:rPr>
+          <w:rFonts w:ascii="Times New Roman" w:hAnsi="Times New Roman" w:cs="Times New Roman"/>
+        </w:rPr>
+      </w:pPr>
+      <w:r>
+        <w:rPr>
+          <w:rFonts w:ascii="Arial" w:hAnsi="Arial"/>
+          <w:color w:val="1E1E1E"/>
+          <w:sz w:val="22"/>
+        </w:rPr>
+        <w:t>Blacksmith Research Colombia S.A.S. es una firma de consultoría estratégica y desarrollo de soluciones de base tecnológica con sede principal en la ciudad de Medellín. Dentro de su portafolio B2B de optimización de procesos corporativos, la compañía opera como el intermediario y gestor central de convenios de bienestar laboral y seguros corporativos para grandes aliados empresariales. Entre sus principales aliados estratégicos se destacan Continental Gold (sector minero a gran escala), Compañía de Financiamiento CDF (sector bancario y financiero) y DXC Technology (sector global de TI).</w:t>
         <w:br/>
         <w:br/>
         <w:t>Para cada uno de estos clientes, Blacksmith gestiona el cobro periódico de los aportes de los empleados hacia planes de Seguro de Vida, Gastos Médicos Mayores (GMM) y Gastos de Administración, garantizando que los montos recaudados coincidan con las tablas de liquidación vigentes y sean remitidos a las entidades aseguradoras de manera oportuna y transparente.</w:t>
@@ -3455,12 +3494,19 @@
     <w:p>
       <w:pPr>
         <w:pStyle w:val="Textbody"/>
-        <w:spacing w:line="276" w:lineRule="auto" w:after="120"/>
-        <w:rPr>
-          <w:rFonts w:ascii="Times New Roman" w:hAnsi="Times New Roman" w:cs="Times New Roman"/>
-        </w:rPr>
-      </w:pPr>
-      <w:r>
+        <w:spacing w:line="360" w:lineRule="auto" w:after="120" w:before="0"/>
+        <w:ind w:firstLine="0"/>
+        <w:jc w:val="both"/>
+        <w:rPr>
+          <w:rFonts w:ascii="Times New Roman" w:hAnsi="Times New Roman" w:cs="Times New Roman"/>
+        </w:rPr>
+      </w:pPr>
+      <w:r>
+        <w:rPr>
+          <w:rFonts w:ascii="Arial" w:hAnsi="Arial"/>
+          <w:color w:val="1E1E1E"/>
+          <w:sz w:val="22"/>
+        </w:rPr>
         <w:t>El proyecto interviene directamente el Departamento de Operaciones y Nómina de Blacksmith Research Colombia S.A.S., el cual tiene a su cargo la recepción, verificación, cómputo y consolidación de las planillas salariales de las empresas cliente.</w:t>
         <w:br/>
         <w:br/>
@@ -3472,7 +3518,7 @@
         <w:br/>
         <w:t>• Salidas y Entregables: Planillas liquidadas en formato Excel estandarizado (desglosadas en Hoja de Resumen de Auditoría y Hoja de Detalle Individual) y logs de dispersión sincronizados en la base de datos cloud.</w:t>
         <w:br/>
-        <w:t>• Responsables: Analista de Nómina (operación y carga), Supervisor de Calidad (auditoría y aprobación) y Director / Administrador (parametrización de reglas).</w:t>
+        <w:t>• Responsables: Analista de Nómina (operación y carga), Supervisor de Calidad (auditoría y aprobación) y Administrador (parametrización de reglas).</w:t>
       </w:r>
     </w:p>
     <w:p>
@@ -3535,16 +3581,23 @@
     <w:p>
       <w:pPr>
         <w:pStyle w:val="Textbody"/>
-        <w:spacing w:line="276" w:lineRule="auto" w:after="120"/>
-        <w:rPr>
-          <w:rFonts w:ascii="Times New Roman" w:hAnsi="Times New Roman" w:cs="Times New Roman"/>
-        </w:rPr>
-      </w:pPr>
-      <w:r>
+        <w:spacing w:line="360" w:lineRule="auto" w:after="120" w:before="0"/>
+        <w:ind w:firstLine="0"/>
+        <w:jc w:val="both"/>
+        <w:rPr>
+          <w:rFonts w:ascii="Times New Roman" w:hAnsi="Times New Roman" w:cs="Times New Roman"/>
+        </w:rPr>
+      </w:pPr>
+      <w:r>
+        <w:rPr>
+          <w:rFonts w:ascii="Arial" w:hAnsi="Arial"/>
+          <w:color w:val="1E1E1E"/>
+          <w:sz w:val="22"/>
+        </w:rPr>
         <w:t>El desarrollo del Sistema Web RPA LAD-6819 se fundamenta en la necesidad imperativa de transformar digitalmente un proceso estratégico que hasta la fecha dependía de métodos manuales vulnerables a fallas. En el sector de la gestión de nóminas, la precisión aritmética y el cumplimiento de las restricciones contractuales son factores críticos; un descuento superior al tope máximo legal no solo vulnera la relación laboral del cliente con sus empleados, sino que genera penalizaciones financieras para Blacksmith.</w:t>
         <w:br/>
         <w:br/>
-        <w:t>La adopción de una arquitectura Fullstack moderna en Next.js 14 y TypeScript elimina por completo la fragmentación tecnológica y los costos derivados del mantenimiento de servidores Python dedicados. Gracias a la computación client-side de alto rendimiento, la validación y cálculo de miles de registros se reduce de más de 48 horas a escasos 1.5 segundos en el navegador, brindando una herramienta autónoma, visualmente ergonómica, resiliente ante la falta de conectividad (Modo Demostración) y con trazabilidad inmutable en Google Cloud Firestore.</w:t>
+        <w:t>Tal como señalan Pressman y Maxim (2020), la adopción de arquitecturas orientadas a componentes y servicios permite mitigar drásticamente los puntos únicos de falla. La unificación del stack tecnológico en Next.js 14 y TypeScript elimina la fragmentación y los costos operativos de servidores dedicados en Python. Mediante computación client-side de alto rendimiento (SheetJS, 2024), la validación y liquidación de miles de registros se reduce de más de 48 horas a escasos 1.5 segundos en el navegador, brindando una herramienta autónoma, resiliente y con trazabilidad inmutable en Google Cloud Firestore.</w:t>
       </w:r>
     </w:p>
     <w:p>
@@ -3607,12 +3660,19 @@
     <w:p>
       <w:pPr>
         <w:pStyle w:val="Textbody"/>
-        <w:spacing w:line="276" w:lineRule="auto" w:after="120"/>
-        <w:rPr>
-          <w:rFonts w:ascii="Times New Roman" w:hAnsi="Times New Roman" w:cs="Times New Roman"/>
-        </w:rPr>
-      </w:pPr>
-      <w:r>
+        <w:spacing w:line="360" w:lineRule="auto" w:after="120" w:before="0"/>
+        <w:ind w:firstLine="0"/>
+        <w:jc w:val="both"/>
+        <w:rPr>
+          <w:rFonts w:ascii="Times New Roman" w:hAnsi="Times New Roman" w:cs="Times New Roman"/>
+        </w:rPr>
+      </w:pPr>
+      <w:r>
+        <w:rPr>
+          <w:rFonts w:ascii="Arial" w:hAnsi="Arial"/>
+          <w:color w:val="1E1E1E"/>
+          <w:sz w:val="22"/>
+        </w:rPr>
         <w:t>Objetivo General:</w:t>
         <w:br/>
         <w:t>Diseñar, desarrollar e implementar un sistema web orquestador Fullstack (RPA LAD-6819) para la automatización, validación paramétrica, liquidación y auditoría de descuentos de nómina de las empresas aliadas de Blacksmith Research Colombia S.A.S.</w:t>
@@ -3691,12 +3751,19 @@
     <w:p>
       <w:pPr>
         <w:pStyle w:val="Textbody"/>
-        <w:spacing w:line="276" w:lineRule="auto" w:after="120"/>
-        <w:rPr>
-          <w:rFonts w:ascii="Times New Roman" w:hAnsi="Times New Roman" w:cs="Times New Roman"/>
-        </w:rPr>
-      </w:pPr>
-      <w:r>
+        <w:spacing w:line="360" w:lineRule="auto" w:after="120" w:before="0"/>
+        <w:ind w:firstLine="0"/>
+        <w:jc w:val="both"/>
+        <w:rPr>
+          <w:rFonts w:ascii="Times New Roman" w:hAnsi="Times New Roman" w:cs="Times New Roman"/>
+        </w:rPr>
+      </w:pPr>
+      <w:r>
+        <w:rPr>
+          <w:rFonts w:ascii="Arial" w:hAnsi="Arial"/>
+          <w:color w:val="1E1E1E"/>
+          <w:sz w:val="22"/>
+        </w:rPr>
         <w:t>El alcance del Sistema Web RPA LAD-6819 delimita las siguientes capacidades y fronteras de operación:</w:t>
         <w:br/>
         <w:br/>
@@ -3761,7 +3828,7 @@
           <w:headerReference w:type="default" r:id="rId10"/>
           <w:footerReference w:type="default" r:id="rId11"/>
           <w:pgSz w:w="11906" w:h="16838"/>
-          <w:pgMar w:top="1474" w:right="1134" w:bottom="1134" w:left="1701" w:header="1134" w:footer="720" w:gutter="0"/>
+          <w:pgMar w:top="1440" w:right="1440" w:bottom="1440" w:left="1440" w:header="1134" w:footer="720" w:gutter="0"/>
           <w:cols w:space="720"/>
           <w:docGrid w:linePitch="326"/>
         </w:sectPr>
@@ -3828,13 +3895,20 @@
     <w:p>
       <w:pPr>
         <w:pStyle w:val="Textbody"/>
-        <w:spacing w:line="276" w:lineRule="auto" w:after="120"/>
-        <w:rPr>
-          <w:rFonts w:ascii="Times New Roman" w:hAnsi="Times New Roman" w:cs="Times New Roman"/>
-        </w:rPr>
-      </w:pPr>
-      <w:r>
-        <w:t>A continuación, se presenta la especificación detallada del Registro de Necesidades de Usuario recolectadas mediante entrevistas y sesiones de levantamiento con los stakeholders de Blacksmith Research Colombia S.A.S. para la concepción de la solución web:</w:t>
+        <w:spacing w:line="360" w:lineRule="auto" w:after="120" w:before="0"/>
+        <w:ind w:firstLine="0"/>
+        <w:jc w:val="both"/>
+        <w:rPr>
+          <w:rFonts w:ascii="Times New Roman" w:hAnsi="Times New Roman" w:cs="Times New Roman"/>
+        </w:rPr>
+      </w:pPr>
+      <w:r>
+        <w:rPr>
+          <w:rFonts w:ascii="Arial" w:hAnsi="Arial"/>
+          <w:color w:val="1E1E1E"/>
+          <w:sz w:val="22"/>
+        </w:rPr>
+        <w:t>A continuación, se presenta la especificación detallada del Registro de Necesidades de Usuario recolectadas mediante entrevistas y sesiones de levantamiento con los stakeholders de Blacksmith Research Colombia S.A.S. para la concepción de la solución web (Tabla 1):</w:t>
       </w:r>
     </w:p>
     <w:p>
@@ -5627,7 +5701,7 @@
         </w:rPr>
         <w:sectPr>
           <w:pgSz w:w="16838" w:h="11906" w:orient="landscape"/>
-          <w:pgMar w:top="1701" w:right="1474" w:bottom="1134" w:left="1134" w:header="1134" w:footer="720" w:gutter="0"/>
+          <w:pgMar w:top="1440" w:right="1440" w:bottom="1440" w:left="1440" w:header="1134" w:footer="720" w:gutter="0"/>
           <w:cols w:space="720"/>
           <w:docGrid w:linePitch="326"/>
         </w:sectPr>
@@ -5723,13 +5797,20 @@
     <w:p>
       <w:pPr>
         <w:pStyle w:val="Textbody"/>
-        <w:spacing w:line="276" w:lineRule="auto" w:after="120"/>
+        <w:spacing w:line="360" w:lineRule="auto" w:after="120" w:before="0"/>
+        <w:ind w:firstLine="0"/>
+        <w:jc w:val="both"/>
         <w:rPr>
           <w:rFonts w:hint="eastAsia"/>
         </w:rPr>
       </w:pPr>
       <w:r>
-        <w:t>Los requisitos funcionales detallan las capacidades, flujos operativos y servicios que el Sistema Web RPA LAD-6819 ofrece a los usuarios según sus roles. A continuación, se documentan individualmente en la plantilla oficial FO-ERS:</w:t>
+        <w:rPr>
+          <w:rFonts w:ascii="Arial" w:hAnsi="Arial"/>
+          <w:color w:val="1E1E1E"/>
+          <w:sz w:val="22"/>
+        </w:rPr>
+        <w:t>Los requisitos funcionales detallan las capacidades, flujos operativos y servicios que el Sistema Web RPA LAD-6819 ofrece a los usuarios según sus roles, siguiendo las pautas de especificación formal de Sommerville (2016). A continuación, se documentan individualmente en la plantilla oficial FO-ERS:</w:t>
       </w:r>
     </w:p>
     <w:p>
@@ -8822,13 +8903,20 @@
     <w:p>
       <w:pPr>
         <w:pStyle w:val="Textbody"/>
-        <w:spacing w:line="276" w:lineRule="auto" w:after="120"/>
+        <w:spacing w:line="360" w:lineRule="auto" w:after="120" w:before="0"/>
+        <w:ind w:firstLine="0"/>
+        <w:jc w:val="both"/>
         <w:rPr>
           <w:rFonts w:hint="eastAsia"/>
         </w:rPr>
       </w:pPr>
       <w:r>
-        <w:t>Los requisitos no funcionales determinan los atributos de calidad, restricciones técnicas, criterios de seguridad y estándares de rendimiento que rigen el comportamiento del sistema. A continuación, se especifican en formato FO-ERS:</w:t>
+        <w:rPr>
+          <w:rFonts w:ascii="Arial" w:hAnsi="Arial"/>
+          <w:color w:val="1E1E1E"/>
+          <w:sz w:val="22"/>
+        </w:rPr>
+        <w:t>Los requisitos no funcionales determinan los atributos de calidad, restricciones técnicas, criterios de seguridad y estándares de rendimiento que rigen el comportamiento del sistema, en concordancia con el estándar ISO/IEC 25010 y las recomendaciones de Pressman y Maxim (2020). A continuación, se especifican en formato FO-ERS:</w:t>
       </w:r>
     </w:p>
     <w:p>
@@ -11123,13 +11211,20 @@
     <w:p>
       <w:pPr>
         <w:pStyle w:val="Textbody"/>
-        <w:spacing w:line="276" w:lineRule="auto" w:after="120"/>
+        <w:spacing w:line="360" w:lineRule="auto" w:after="80" w:before="240"/>
+        <w:ind w:firstLine="0"/>
+        <w:jc w:val="center"/>
         <w:rPr>
           <w:rFonts w:hint="eastAsia"/>
         </w:rPr>
       </w:pPr>
       <w:r>
-        <w:t>El modelado de interacción del Sistema Web RPA LAD-6819 describe el flujo cronológico de mensajes, llamadas asíncronas y transformaciones de datos entre los actores y los componentes de software. A continuación, se presenta el análisis técnico de los tiempos de iteración, concurrencia y el Diagrama de Secuencia formal bajo el estándar UML 2.5:</w:t>
+        <w:rPr>
+          <w:rFonts w:ascii="Arial" w:hAnsi="Arial"/>
+          <w:color w:val="1E1E1E"/>
+          <w:sz w:val="22"/>
+        </w:rPr>
+        <w:t>El modelado de interacción del Sistema Web RPA LAD-6819 describe el flujo cronológico de mensajes, llamadas asíncronas y transformaciones de datos entre los actores y los componentes de software, modelado bajo la especificación formal UML 2.5 (Object Management Group [OMG], 2017). A continuación, se presenta el análisis técnico de los tiempos de iteración, concurrencia y la Figura 3.1:</w:t>
         <w:br/>
         <w:br/>
         <w:t>Análisis de Concurrencia y Tiempos de Iteración:</w:t>
@@ -11145,8 +11240,27 @@
         <w:t>• Concurrencia Multiusuario: Al ejecutarse el cómputo intensivo en el navegador de cada usuario y delegar la persistencia a Google Cloud Firestore (diseñado para escalar elásticamente a miles de escrituras por segundo), el sistema opera sin bloqueos de locks a nivel de base de datos relacional, garantizando que decenas de analistas puedan procesar planillas en paralelo de manera independiente.</w:t>
       </w:r>
       <w:r>
+        <w:rPr>
+          <w:rFonts w:ascii="Arial" w:hAnsi="Arial"/>
+          <w:b/>
+          <w:color w:val="141414"/>
+          <w:sz w:val="21"/>
+        </w:rPr>
         <w:br/>
+        <w:t>Figura 3.1</w:t>
         <w:br/>
+      </w:r>
+      <w:r>
+        <w:rPr>
+          <w:rFonts w:ascii="Arial" w:hAnsi="Arial"/>
+          <w:i/>
+          <w:color w:val="282828"/>
+          <w:sz w:val="20"/>
+        </w:rPr>
+        <w:t>Diagrama de Secuencia UML 2.5 para la Orquestación de Nómina, Tiempos de Iteración y Concurrencia.</w:t>
+        <w:br/>
+      </w:r>
+      <w:r>
         <w:drawing>
           <wp:inline xmlns:a="http://schemas.openxmlformats.org/drawingml/2006/main" xmlns:pic="http://schemas.openxmlformats.org/drawingml/2006/picture">
             <wp:extent cx="5669280" cy="3504646"/>
@@ -11182,13 +11296,21 @@
       </w:r>
       <w:r>
         <w:rPr>
-          <w:b/>
+          <w:rFonts w:ascii="Arial" w:hAnsi="Arial"/>
           <w:i/>
-          <w:color w:val="464646"/>
+          <w:color w:val="3C3C3C"/>
           <w:sz w:val="19"/>
         </w:rPr>
         <w:br/>
-        <w:t>Figura 3.1: Diagrama de Secuencia UML 2.5 - Orquestación de Descuentos, Tiempos de Iteración y Concurrencia.</w:t>
+        <w:t xml:space="preserve">Nota. </w:t>
+      </w:r>
+      <w:r>
+        <w:rPr>
+          <w:rFonts w:ascii="Arial" w:hAnsi="Arial"/>
+          <w:color w:val="3C3C3C"/>
+          <w:sz w:val="19"/>
+        </w:rPr>
+        <w:t>Interacciones síncronas y asíncronas entre el usuario, el cliente Next.js, el motor SheetJS y la nube Firebase. Fuente: Elaboración propia (2026).</w:t>
         <w:br/>
       </w:r>
     </w:p>
@@ -11260,12 +11382,19 @@
     <w:p>
       <w:pPr>
         <w:pStyle w:val="Textbody"/>
-        <w:spacing w:line="276" w:lineRule="auto" w:after="120"/>
+        <w:spacing w:line="360" w:lineRule="auto" w:after="80" w:before="240"/>
+        <w:ind w:firstLine="0"/>
+        <w:jc w:val="center"/>
         <w:rPr>
           <w:rFonts w:hint="eastAsia"/>
         </w:rPr>
       </w:pPr>
       <w:r>
+        <w:rPr>
+          <w:rFonts w:ascii="Arial" w:hAnsi="Arial"/>
+          <w:color w:val="1E1E1E"/>
+          <w:sz w:val="22"/>
+        </w:rPr>
         <w:t>El modelado de casos de uso delimita las interacciones entre los actores del sistema y los servicios del software. Los actores identificados son:</w:t>
         <w:br/>
         <w:t>• Administrador (Wilmer Vega): Posee privilegios totales de configuración de empresas, parametrización de reglas de negocio, consulta global y auditoría.</w:t>
@@ -11275,11 +11404,30 @@
         <w:t>• Analista de Nómina (Juan Santana): Responsable de la operación cotidiana, carga de archivos de nómina, resolución de alertas y registro de pagos únicos.</w:t>
         <w:br/>
         <w:br/>
-        <w:t>A continuación, se ilustra el Diagrama de Casos de Uso del sistema y la especificación detallada de los casos de uso críticos en la plantilla institucional:</w:t>
-      </w:r>
-      <w:r>
+        <w:t>A continuación, se ilustra la Figura 3.2 y la especificación detallada de los casos de uso críticos en la plantilla institucional:</w:t>
+      </w:r>
+      <w:r>
+        <w:rPr>
+          <w:rFonts w:ascii="Arial" w:hAnsi="Arial"/>
+          <w:b/>
+          <w:color w:val="141414"/>
+          <w:sz w:val="21"/>
+        </w:rPr>
         <w:br/>
+        <w:t>Figura 3.2</w:t>
         <w:br/>
+      </w:r>
+      <w:r>
+        <w:rPr>
+          <w:rFonts w:ascii="Arial" w:hAnsi="Arial"/>
+          <w:i/>
+          <w:color w:val="282828"/>
+          <w:sz w:val="20"/>
+        </w:rPr>
+        <w:t>Diagrama de Casos de Uso del Sistema Web RPA LAD-6819.</w:t>
+        <w:br/>
+      </w:r>
+      <w:r>
         <w:drawing>
           <wp:inline xmlns:a="http://schemas.openxmlformats.org/drawingml/2006/main" xmlns:pic="http://schemas.openxmlformats.org/drawingml/2006/picture">
             <wp:extent cx="5669280" cy="3453107"/>
@@ -11315,13 +11463,21 @@
       </w:r>
       <w:r>
         <w:rPr>
-          <w:b/>
+          <w:rFonts w:ascii="Arial" w:hAnsi="Arial"/>
           <w:i/>
-          <w:color w:val="464646"/>
+          <w:color w:val="3C3C3C"/>
           <w:sz w:val="19"/>
         </w:rPr>
         <w:br/>
-        <w:t>Figura 3.2: Diagrama de Casos de Uso del Sistema Web RPA LAD-6819.</w:t>
+        <w:t xml:space="preserve">Nota. </w:t>
+      </w:r>
+      <w:r>
+        <w:rPr>
+          <w:rFonts w:ascii="Arial" w:hAnsi="Arial"/>
+          <w:color w:val="3C3C3C"/>
+          <w:sz w:val="19"/>
+        </w:rPr>
+        <w:t>Casos de uso del sistema estructurados con relaciones de inclusión y extensión según el rol de usuario. Fuente: Elaboración propia (2026).</w:t>
         <w:br/>
       </w:r>
     </w:p>
@@ -12620,13 +12776,20 @@
     <w:p>
       <w:pPr>
         <w:pStyle w:val="Textbody"/>
-        <w:spacing w:line="276" w:lineRule="auto" w:after="120"/>
-        <w:rPr>
-          <w:rFonts w:ascii="Times New Roman" w:hAnsi="Times New Roman" w:cs="Times New Roman"/>
-        </w:rPr>
-      </w:pPr>
-      <w:r>
-        <w:t>La solución tecnológica adoptada para el Sistema Web RPA LAD-6819 se fundamenta en un ecosistema Fullstack unificado de última generación, desarrollado íntegramente sobre TypeScript y Node.js con Next.js 14 (App Router). Se suprimió la dependencia anterior de servidores intermedios en Python (FastAPI y Pandas), logrando una arquitectura altamente cohesionada, eficiente y sin sobrecostos de hosting.</w:t>
+        <w:spacing w:line="360" w:lineRule="auto" w:after="120" w:before="0"/>
+        <w:ind w:firstLine="0"/>
+        <w:jc w:val="both"/>
+        <w:rPr>
+          <w:rFonts w:ascii="Times New Roman" w:hAnsi="Times New Roman" w:cs="Times New Roman"/>
+        </w:rPr>
+      </w:pPr>
+      <w:r>
+        <w:rPr>
+          <w:rFonts w:ascii="Arial" w:hAnsi="Arial"/>
+          <w:color w:val="1E1E1E"/>
+          <w:sz w:val="22"/>
+        </w:rPr>
+        <w:t>La solución tecnológica adoptada para el Sistema Web RPA LAD-6819 se fundamenta en un ecosistema Fullstack unificado de última generación, desarrollado íntegramente sobre TypeScript y Node.js con Next.js 14 App Router (Vercel, 2024). Se suprimió la dependencia anterior de servidores intermedios en Python (FastAPI y Pandas), logrando una arquitectura altamente cohesionada, eficiente y sin sobrecostos de hosting.</w:t>
         <w:br/>
         <w:br/>
         <w:t>Especificación de Tecnologías y Componentes:</w:t>
@@ -12635,9 +12798,9 @@
         <w:br/>
         <w:t>• Componente Backend: Next.js API Route Handlers en Node.js, implementando arquitectura RESTful (/api/health, /api/empresas, /api/pagos, /api/nomina/procesar).</w:t>
         <w:br/>
-        <w:t>• Motor de Procesamiento de Hojas de Cálculo: Biblioteca SheetJS (xlsx) ejecutada en el cliente, permitiendo el parseo y cálculo vectorial de miles de filas en milisegundos sin enviar archivos pesados a la red.</w:t>
+        <w:t>• Motor de Procesamiento de Hojas de Cálculo: Biblioteca SheetJS (xlsx) ejecutada en el cliente, permitiendo el parseo y cálculo vectorial de miles de filas en milisegundos sin enviar archivos pesados a la red (SheetJS, 2024).</w:t>
         <w:br/>
-        <w:t>• Base de Datos y Persistencia Cloud: Google Cloud Firebase Firestore (Base de datos NoSQL documental con sincronización bidireccional reactiva mediante WebSockets y suscripciones onSnapshot).</w:t>
+        <w:t>• Base de Datos y Persistencia Cloud: Google Cloud Firebase Firestore (Base de datos NoSQL documental con sincronización bidireccional reactiva mediante WebSockets y suscripciones onSnapshot) (Google Cloud, 2024).</w:t>
         <w:br/>
         <w:t>• Seguridad y Autenticación: Google Firebase Authentication con soporte de tokens JWT y control de acceso RBAC.</w:t>
         <w:br/>
@@ -12723,13 +12886,20 @@
     <w:p>
       <w:pPr>
         <w:pStyle w:val="Textbody"/>
-        <w:spacing w:line="276" w:lineRule="auto" w:after="120"/>
-        <w:rPr>
-          <w:rFonts w:ascii="Times New Roman" w:hAnsi="Times New Roman" w:cs="Times New Roman"/>
-        </w:rPr>
-      </w:pPr>
-      <w:r>
-        <w:t>La arquitectura física y lógica del Sistema Web RPA LAD-6819 se concibe bajo el patrón de Arquitectura por Capas (Layered Architecture) complementado con el modelo Backend-as-a-Service (BaaS) y computación en el Edge/Cliente:</w:t>
+        <w:spacing w:line="360" w:lineRule="auto" w:after="80" w:before="240"/>
+        <w:ind w:firstLine="0"/>
+        <w:jc w:val="center"/>
+        <w:rPr>
+          <w:rFonts w:ascii="Times New Roman" w:hAnsi="Times New Roman" w:cs="Times New Roman"/>
+        </w:rPr>
+      </w:pPr>
+      <w:r>
+        <w:rPr>
+          <w:rFonts w:ascii="Arial" w:hAnsi="Arial"/>
+          <w:color w:val="1E1E1E"/>
+          <w:sz w:val="22"/>
+        </w:rPr>
+        <w:t>La arquitectura física y lógica del Sistema Web RPA LAD-6819 se concibe bajo el patrón de Arquitectura por Capas (Layered Architecture) complementado con el modelo Backend-as-a-Service (BaaS) y computación en el Edge/Cliente (Pressman &amp; Maxim, 2020):</w:t>
         <w:br/>
         <w:br/>
         <w:t>1. Capa de Presentación (UI/UX): Desarrollada con React y Tailwind CSS, encapsula módulos desacoplados para Carga Masiva, Pagos Únicos, Gestión de Empresas, Centro de Control y Auditoría de Roles. Aplica el principio de inversión de control y suscripciones reactivas.</w:t>
@@ -12739,11 +12909,30 @@
         <w:t>3. Capa de Persistencia y Servicios Cloud: Soportada en Google Firebase Firestore (colecciones 'empresas', 'jobs', 'pagos_individuales') y endpoints nativos de Next.js en Node.js, ofreciendo sincronización multicliente en tiempo real sin concurrencia bloqueante.</w:t>
         <w:br/>
         <w:br/>
-        <w:t>A continuación, se ilustra la arquitectura técnica mediante el diagrama oficial de componentes:</w:t>
-      </w:r>
-      <w:r>
+        <w:t>A continuación, se ilustra la arquitectura técnica mediante la Figura 4.2:</w:t>
+      </w:r>
+      <w:r>
+        <w:rPr>
+          <w:rFonts w:ascii="Arial" w:hAnsi="Arial"/>
+          <w:b/>
+          <w:color w:val="141414"/>
+          <w:sz w:val="21"/>
+        </w:rPr>
         <w:br/>
+        <w:t>Figura 4.2</w:t>
         <w:br/>
+      </w:r>
+      <w:r>
+        <w:rPr>
+          <w:rFonts w:ascii="Arial" w:hAnsi="Arial"/>
+          <w:i/>
+          <w:color w:val="282828"/>
+          <w:sz w:val="20"/>
+        </w:rPr>
+        <w:t>Diagrama de Arquitectura de Componentes Fullstack Next.js + Firebase.</w:t>
+        <w:br/>
+      </w:r>
+      <w:r>
         <w:drawing>
           <wp:inline xmlns:a="http://schemas.openxmlformats.org/drawingml/2006/main" xmlns:pic="http://schemas.openxmlformats.org/drawingml/2006/picture">
             <wp:extent cx="5669280" cy="3401568"/>
@@ -12779,13 +12968,21 @@
       </w:r>
       <w:r>
         <w:rPr>
-          <w:b/>
+          <w:rFonts w:ascii="Arial" w:hAnsi="Arial"/>
           <w:i/>
-          <w:color w:val="464646"/>
+          <w:color w:val="3C3C3C"/>
           <w:sz w:val="19"/>
         </w:rPr>
         <w:br/>
-        <w:t>Figura 4.2: Diagrama de Arquitectura de Componentes Fullstack Next.js + Firebase.</w:t>
+        <w:t xml:space="preserve">Nota. </w:t>
+      </w:r>
+      <w:r>
+        <w:rPr>
+          <w:rFonts w:ascii="Arial" w:hAnsi="Arial"/>
+          <w:color w:val="3C3C3C"/>
+          <w:sz w:val="19"/>
+        </w:rPr>
+        <w:t>Estructura en capas desacopladas con procesamiento client-side en SheetJS y persistencia reactiva en Firebase Firestore. Fuente: Elaboración propia (2026).</w:t>
         <w:br/>
       </w:r>
     </w:p>
@@ -12857,12 +13054,19 @@
     <w:p>
       <w:pPr>
         <w:pStyle w:val="Textbody"/>
-        <w:spacing w:line="276" w:lineRule="auto" w:after="120"/>
-        <w:rPr>
-          <w:rFonts w:ascii="Times New Roman" w:hAnsi="Times New Roman" w:cs="Times New Roman"/>
-        </w:rPr>
-      </w:pPr>
-      <w:r>
+        <w:spacing w:line="360" w:lineRule="auto" w:after="80" w:before="240"/>
+        <w:ind w:firstLine="0"/>
+        <w:jc w:val="center"/>
+        <w:rPr>
+          <w:rFonts w:ascii="Times New Roman" w:hAnsi="Times New Roman" w:cs="Times New Roman"/>
+        </w:rPr>
+      </w:pPr>
+      <w:r>
+        <w:rPr>
+          <w:rFonts w:ascii="Arial" w:hAnsi="Arial"/>
+          <w:color w:val="1E1E1E"/>
+          <w:sz w:val="22"/>
+        </w:rPr>
         <w:t>El Diagrama de Despliegue especifica la distribución física y lógica de los nodos de computación y artefactos de software del sistema:</w:t>
         <w:br/>
         <w:t>• Nodo Cliente (Dispositivo de Usuario): Ejecuta el navegador web donde se procesan los componentes de la interfaz de usuario, el motor SheetJS y los scripts de validación en tiempo real.</w:t>
@@ -12872,11 +13076,30 @@
         <w:t>• Nodo Nube Google Firebase: Aloja los servicios administrados de Cloud Firestore para almacenamiento NoSQL reactivo y Firebase Auth para autenticación segura bajo certificación SOC 2 y cifrado TLS 1.3.</w:t>
         <w:br/>
         <w:br/>
-        <w:t>A continuación, se presenta el Diagrama de Despliegue de la infraestructura:</w:t>
-      </w:r>
-      <w:r>
+        <w:t>A continuación, se presenta la Figura 4.3:</w:t>
+      </w:r>
+      <w:r>
+        <w:rPr>
+          <w:rFonts w:ascii="Arial" w:hAnsi="Arial"/>
+          <w:b/>
+          <w:color w:val="141414"/>
+          <w:sz w:val="21"/>
+        </w:rPr>
         <w:br/>
+        <w:t>Figura 4.3</w:t>
         <w:br/>
+      </w:r>
+      <w:r>
+        <w:rPr>
+          <w:rFonts w:ascii="Arial" w:hAnsi="Arial"/>
+          <w:i/>
+          <w:color w:val="282828"/>
+          <w:sz w:val="20"/>
+        </w:rPr>
+        <w:t>Diagrama de Despliegue de Infraestructura Cloud y Edge.</w:t>
+        <w:br/>
+      </w:r>
+      <w:r>
         <w:drawing>
           <wp:inline xmlns:a="http://schemas.openxmlformats.org/drawingml/2006/main" xmlns:pic="http://schemas.openxmlformats.org/drawingml/2006/picture">
             <wp:extent cx="5669280" cy="3481137"/>
@@ -12912,13 +13135,21 @@
       </w:r>
       <w:r>
         <w:rPr>
-          <w:b/>
+          <w:rFonts w:ascii="Arial" w:hAnsi="Arial"/>
           <w:i/>
-          <w:color w:val="464646"/>
+          <w:color w:val="3C3C3C"/>
           <w:sz w:val="19"/>
         </w:rPr>
         <w:br/>
-        <w:t>Figura 4.3: Diagrama de Despliegue de Infraestructura Cloud y Edge.</w:t>
+        <w:t xml:space="preserve">Nota. </w:t>
+      </w:r>
+      <w:r>
+        <w:rPr>
+          <w:rFonts w:ascii="Arial" w:hAnsi="Arial"/>
+          <w:color w:val="3C3C3C"/>
+          <w:sz w:val="19"/>
+        </w:rPr>
+        <w:t>Topología física de ejecución entre dispositivos clientes, runtime Node.js local y nube administrada Google Firebase. Fuente: Elaboración propia (2026).</w:t>
         <w:br/>
       </w:r>
     </w:p>
@@ -12990,12 +13221,19 @@
     <w:p>
       <w:pPr>
         <w:pStyle w:val="Textbody"/>
-        <w:spacing w:line="276" w:lineRule="auto" w:after="120"/>
-        <w:rPr>
-          <w:rFonts w:ascii="Times New Roman" w:hAnsi="Times New Roman" w:cs="Times New Roman"/>
-        </w:rPr>
-      </w:pPr>
-      <w:r>
+        <w:spacing w:line="360" w:lineRule="auto" w:after="80" w:before="240"/>
+        <w:ind w:firstLine="0"/>
+        <w:jc w:val="center"/>
+        <w:rPr>
+          <w:rFonts w:ascii="Times New Roman" w:hAnsi="Times New Roman" w:cs="Times New Roman"/>
+        </w:rPr>
+      </w:pPr>
+      <w:r>
+        <w:rPr>
+          <w:rFonts w:ascii="Arial" w:hAnsi="Arial"/>
+          <w:color w:val="1E1E1E"/>
+          <w:sz w:val="22"/>
+        </w:rPr>
         <w:t>La modularidad del código fuente se organiza bajo una estructura limpia de paquetes en TypeScript, garantizando alta cohesión y bajo acoplamiento entre los subsistemas:</w:t>
         <w:br/>
         <w:t>• Paquete 'app': Aloja la configuración del App Router de Next.js 14, rutas de vistas ('page.tsx', 'layout.tsx', 'loading.tsx', 'error.tsx') y los subpaquetes de API Route Handlers ('app/api/*').</w:t>
@@ -13007,11 +13245,30 @@
         <w:t>• Paquete 'types': Define las interfaces TypeScript universales ('Empresa', 'ReglasNegocio', 'LoteNomina', 'RegistroNomina', 'Usuario').</w:t>
         <w:br/>
         <w:br/>
-        <w:t>A continuación, se ilustra la organización de paquetes del software:</w:t>
-      </w:r>
-      <w:r>
+        <w:t>A continuación, se ilustra la organización de paquetes mediante la Figura 4.4:</w:t>
+      </w:r>
+      <w:r>
+        <w:rPr>
+          <w:rFonts w:ascii="Arial" w:hAnsi="Arial"/>
+          <w:b/>
+          <w:color w:val="141414"/>
+          <w:sz w:val="21"/>
+        </w:rPr>
         <w:br/>
+        <w:t>Figura 4.4</w:t>
         <w:br/>
+      </w:r>
+      <w:r>
+        <w:rPr>
+          <w:rFonts w:ascii="Arial" w:hAnsi="Arial"/>
+          <w:i/>
+          <w:color w:val="282828"/>
+          <w:sz w:val="20"/>
+        </w:rPr>
+        <w:t>Diagrama de Paquetes de la Solución de Software.</w:t>
+        <w:br/>
+      </w:r>
+      <w:r>
         <w:drawing>
           <wp:inline xmlns:a="http://schemas.openxmlformats.org/drawingml/2006/main" xmlns:pic="http://schemas.openxmlformats.org/drawingml/2006/picture">
             <wp:extent cx="5669280" cy="3401568"/>
@@ -13047,13 +13304,21 @@
       </w:r>
       <w:r>
         <w:rPr>
-          <w:b/>
+          <w:rFonts w:ascii="Arial" w:hAnsi="Arial"/>
           <w:i/>
-          <w:color w:val="464646"/>
+          <w:color w:val="3C3C3C"/>
           <w:sz w:val="19"/>
         </w:rPr>
         <w:br/>
-        <w:t>Figura 4.4: Diagrama de Paquetes de la Solución de Software.</w:t>
+        <w:t xml:space="preserve">Nota. </w:t>
+      </w:r>
+      <w:r>
+        <w:rPr>
+          <w:rFonts w:ascii="Arial" w:hAnsi="Arial"/>
+          <w:color w:val="3C3C3C"/>
+          <w:sz w:val="19"/>
+        </w:rPr>
+        <w:t>Descomposición modular de módulos, controladores, bibliotecas de procesamiento y tipados del sistema. Fuente: Elaboración propia (2026).</w:t>
         <w:br/>
       </w:r>
     </w:p>
@@ -13125,12 +13390,19 @@
     <w:p>
       <w:pPr>
         <w:pStyle w:val="Textbody"/>
-        <w:spacing w:line="276" w:lineRule="auto" w:after="120"/>
-        <w:rPr>
-          <w:rFonts w:ascii="Times New Roman" w:hAnsi="Times New Roman" w:cs="Times New Roman"/>
-        </w:rPr>
-      </w:pPr>
-      <w:r>
+        <w:spacing w:line="360" w:lineRule="auto" w:after="80" w:before="240"/>
+        <w:ind w:firstLine="0"/>
+        <w:jc w:val="center"/>
+        <w:rPr>
+          <w:rFonts w:ascii="Times New Roman" w:hAnsi="Times New Roman" w:cs="Times New Roman"/>
+        </w:rPr>
+      </w:pPr>
+      <w:r>
+        <w:rPr>
+          <w:rFonts w:ascii="Arial" w:hAnsi="Arial"/>
+          <w:color w:val="1E1E1E"/>
+          <w:sz w:val="22"/>
+        </w:rPr>
         <w:t>El modelado de clases y tipos del dominio refleja las entidades del negocio de nómina y su comportamiento algorítmico:</w:t>
         <w:br/>
         <w:t>• Empresa: Modela al aliado corporativo (Continental Gold, CDF, DXC) con atributos como Razón Social, NIT y relación de agregación hacia 'ReglasNegocio'.</w:t>
@@ -13146,11 +13418,30 @@
         <w:t>• ExcelProcessor: Clase/módulo estático con métodos 'parsearPlanilla()', 'validarEstructura()', 'calcularDescuentos()' y 'generarExcelConsolidado()'.</w:t>
         <w:br/>
         <w:br/>
-        <w:t>A continuación, se presenta el Diagrama de Clases del dominio del sistema:</w:t>
-      </w:r>
-      <w:r>
+        <w:t>A continuación, se presenta la Figura 4.5:</w:t>
+      </w:r>
+      <w:r>
+        <w:rPr>
+          <w:rFonts w:ascii="Arial" w:hAnsi="Arial"/>
+          <w:b/>
+          <w:color w:val="141414"/>
+          <w:sz w:val="21"/>
+        </w:rPr>
         <w:br/>
+        <w:t>Figura 4.5</w:t>
         <w:br/>
+      </w:r>
+      <w:r>
+        <w:rPr>
+          <w:rFonts w:ascii="Arial" w:hAnsi="Arial"/>
+          <w:i/>
+          <w:color w:val="282828"/>
+          <w:sz w:val="20"/>
+        </w:rPr>
+        <w:t>Diagrama de Clases del Dominio y Reglas de Negocio.</w:t>
+        <w:br/>
+      </w:r>
+      <w:r>
         <w:drawing>
           <wp:inline xmlns:a="http://schemas.openxmlformats.org/drawingml/2006/main" xmlns:pic="http://schemas.openxmlformats.org/drawingml/2006/picture">
             <wp:extent cx="5669280" cy="3556185"/>
@@ -13186,13 +13477,21 @@
       </w:r>
       <w:r>
         <w:rPr>
-          <w:b/>
+          <w:rFonts w:ascii="Arial" w:hAnsi="Arial"/>
           <w:i/>
-          <w:color w:val="464646"/>
+          <w:color w:val="3C3C3C"/>
           <w:sz w:val="19"/>
         </w:rPr>
         <w:br/>
-        <w:t>Figura 4.5: Diagrama de Clases del Dominio y Reglas de Negocio.</w:t>
+        <w:t xml:space="preserve">Nota. </w:t>
+      </w:r>
+      <w:r>
+        <w:rPr>
+          <w:rFonts w:ascii="Arial" w:hAnsi="Arial"/>
+          <w:color w:val="3C3C3C"/>
+          <w:sz w:val="19"/>
+        </w:rPr>
+        <w:t>Clases y relaciones estructurales del dominio de liquidación paramétrica de nómina. Fuente: Elaboración propia (2026).</w:t>
         <w:br/>
       </w:r>
     </w:p>
@@ -13264,12 +13563,19 @@
     <w:p>
       <w:pPr>
         <w:pStyle w:val="Textbody"/>
-        <w:spacing w:line="276" w:lineRule="auto" w:after="120"/>
-        <w:rPr>
-          <w:rFonts w:ascii="Times New Roman" w:hAnsi="Times New Roman" w:cs="Times New Roman"/>
-        </w:rPr>
-      </w:pPr>
-      <w:r>
+        <w:spacing w:line="360" w:lineRule="auto" w:after="80" w:before="240"/>
+        <w:ind w:firstLine="0"/>
+        <w:jc w:val="center"/>
+        <w:rPr>
+          <w:rFonts w:ascii="Times New Roman" w:hAnsi="Times New Roman" w:cs="Times New Roman"/>
+        </w:rPr>
+      </w:pPr>
+      <w:r>
+        <w:rPr>
+          <w:rFonts w:ascii="Arial" w:hAnsi="Arial"/>
+          <w:color w:val="1E1E1E"/>
+          <w:sz w:val="22"/>
+        </w:rPr>
         <w:t>El prototipo del Sistema Web RPA LAD-6819 se encuentra totalmente desarrollado, operativo y verificado en entorno local (http://localhost:3001) y en la nube. A continuación, se detallan las interfaces de usuario que componen la solución:</w:t>
         <w:br/>
         <w:br/>
@@ -13286,11 +13592,30 @@
         <w:t>6. Módulo de Auditoría de Roles: Matriz visual de segregación de responsabilidades que documenta los privilegios de cada perfil.</w:t>
         <w:br/>
         <w:br/>
-        <w:t>A continuación, se presentan las capturas oficiales de las interfaces de usuario del sistema web:</w:t>
-      </w:r>
-      <w:r>
+        <w:t>A continuación, se presentan las capturas oficiales de las interfaces de usuario del sistema web (Figuras 4.6.1 a 4.6.3):</w:t>
+      </w:r>
+      <w:r>
+        <w:rPr>
+          <w:rFonts w:ascii="Arial" w:hAnsi="Arial"/>
+          <w:b/>
+          <w:color w:val="141414"/>
+          <w:sz w:val="21"/>
+        </w:rPr>
         <w:br/>
+        <w:t>Figura 4.6.1</w:t>
         <w:br/>
+      </w:r>
+      <w:r>
+        <w:rPr>
+          <w:rFonts w:ascii="Arial" w:hAnsi="Arial"/>
+          <w:i/>
+          <w:color w:val="282828"/>
+          <w:sz w:val="20"/>
+        </w:rPr>
+        <w:t>Interfaz Principal del Centro de Control y Zona de Carga Masiva de Planillas de Nómina.</w:t>
+        <w:br/>
+      </w:r>
+      <w:r>
         <w:drawing>
           <wp:inline xmlns:a="http://schemas.openxmlformats.org/drawingml/2006/main" xmlns:pic="http://schemas.openxmlformats.org/drawingml/2006/picture">
             <wp:extent cx="5669280" cy="3194506"/>
@@ -13326,18 +13651,45 @@
       </w:r>
       <w:r>
         <w:rPr>
+          <w:rFonts w:ascii="Arial" w:hAnsi="Arial"/>
+          <w:i/>
+          <w:color w:val="3C3C3C"/>
+          <w:sz w:val="19"/>
+        </w:rPr>
+        <w:br/>
+        <w:t xml:space="preserve">Nota. </w:t>
+      </w:r>
+      <w:r>
+        <w:rPr>
+          <w:rFonts w:ascii="Arial" w:hAnsi="Arial"/>
+          <w:color w:val="3C3C3C"/>
+          <w:sz w:val="19"/>
+        </w:rPr>
+        <w:t>Vista operativa en Next.js con carga Drag &amp; Drop, selección de aliados y tabla de monitoreo en tiempo real. Fuente: Elaboración propia (2026).</w:t>
+        <w:br/>
+      </w:r>
+      <w:r>
+        <w:rPr>
+          <w:rFonts w:ascii="Arial" w:hAnsi="Arial"/>
           <w:b/>
+          <w:color w:val="141414"/>
+          <w:sz w:val="21"/>
+        </w:rPr>
+        <w:br/>
+        <w:t>Figura 4.6.2</w:t>
+        <w:br/>
+      </w:r>
+      <w:r>
+        <w:rPr>
+          <w:rFonts w:ascii="Arial" w:hAnsi="Arial"/>
           <w:i/>
-          <w:color w:val="464646"/>
-          <w:sz w:val="19"/>
-        </w:rPr>
+          <w:color w:val="282828"/>
+          <w:sz w:val="20"/>
+        </w:rPr>
+        <w:t>Tarjetas de Monitoreo KPI Gerencial y Selector de Clientes Corporativos.</w:t>
         <w:br/>
-        <w:t>Figura 4.6.1: Interfaz Principal del Centro de Control y Zona de Carga Masiva de Planillas de Nómina.</w:t>
-        <w:br/>
-      </w:r>
-      <w:r>
-        <w:br/>
-        <w:br/>
+      </w:r>
+      <w:r>
         <w:drawing>
           <wp:inline xmlns:a="http://schemas.openxmlformats.org/drawingml/2006/main" xmlns:pic="http://schemas.openxmlformats.org/drawingml/2006/picture">
             <wp:extent cx="5669280" cy="2380655"/>
@@ -13373,18 +13725,45 @@
       </w:r>
       <w:r>
         <w:rPr>
+          <w:rFonts w:ascii="Arial" w:hAnsi="Arial"/>
+          <w:i/>
+          <w:color w:val="3C3C3C"/>
+          <w:sz w:val="19"/>
+        </w:rPr>
+        <w:br/>
+        <w:t xml:space="preserve">Nota. </w:t>
+      </w:r>
+      <w:r>
+        <w:rPr>
+          <w:rFonts w:ascii="Arial" w:hAnsi="Arial"/>
+          <w:color w:val="3C3C3C"/>
+          <w:sz w:val="19"/>
+        </w:rPr>
+        <w:t>Indicadores de efectividad, resumen de lotes registrados y despacho manual segmentado por empresa. Fuente: Elaboración propia (2026).</w:t>
+        <w:br/>
+      </w:r>
+      <w:r>
+        <w:rPr>
+          <w:rFonts w:ascii="Arial" w:hAnsi="Arial"/>
           <w:b/>
+          <w:color w:val="141414"/>
+          <w:sz w:val="21"/>
+        </w:rPr>
+        <w:br/>
+        <w:t>Figura 4.6.3</w:t>
+        <w:br/>
+      </w:r>
+      <w:r>
+        <w:rPr>
+          <w:rFonts w:ascii="Arial" w:hAnsi="Arial"/>
           <w:i/>
-          <w:color w:val="464646"/>
-          <w:sz w:val="19"/>
-        </w:rPr>
+          <w:color w:val="282828"/>
+          <w:sz w:val="20"/>
+        </w:rPr>
+        <w:t>Integración de Persistencia y Seguridad Cloud en Google Firebase.</w:t>
         <w:br/>
-        <w:t>Figura 4.6.2: Tarjetas de Monitoreo KPI Gerencial y Selector de Clientes Corporativos.</w:t>
-        <w:br/>
-      </w:r>
-      <w:r>
-        <w:br/>
-        <w:br/>
+      </w:r>
+      <w:r>
         <w:drawing>
           <wp:inline xmlns:a="http://schemas.openxmlformats.org/drawingml/2006/main" xmlns:pic="http://schemas.openxmlformats.org/drawingml/2006/picture">
             <wp:extent cx="5669280" cy="3554372"/>
@@ -13420,13 +13799,21 @@
       </w:r>
       <w:r>
         <w:rPr>
-          <w:b/>
+          <w:rFonts w:ascii="Arial" w:hAnsi="Arial"/>
           <w:i/>
-          <w:color w:val="464646"/>
+          <w:color w:val="3C3C3C"/>
           <w:sz w:val="19"/>
         </w:rPr>
         <w:br/>
-        <w:t>Figura 4.6.3: Integración de Persistencia y Seguridad Cloud en Google Firebase.</w:t>
+        <w:t xml:space="preserve">Nota. </w:t>
+      </w:r>
+      <w:r>
+        <w:rPr>
+          <w:rFonts w:ascii="Arial" w:hAnsi="Arial"/>
+          <w:color w:val="3C3C3C"/>
+          <w:sz w:val="19"/>
+        </w:rPr>
+        <w:t>Consola de administración de Cloud Firestore y Firebase Auth para resguardo de transacciones. Fuente: Elaboración propia (2026).</w:t>
         <w:br/>
       </w:r>
     </w:p>
@@ -13452,9 +13839,122 @@
         </w:rPr>
       </w:pPr>
     </w:p>
+    <w:p>
+      <w:pPr>
+        <w:pStyle w:val="Ttulo1"/>
+        <w:spacing w:before="360" w:after="240"/>
+        <w:jc w:val="center"/>
+      </w:pPr>
+      <w:r>
+        <w:rPr>
+          <w:rFonts w:ascii="Arial" w:hAnsi="Arial"/>
+          <w:b/>
+          <w:sz w:val="24"/>
+        </w:rPr>
+        <w:t>REFERENCIAS</w:t>
+      </w:r>
+    </w:p>
+    <w:p>
+      <w:pPr>
+        <w:spacing w:line="360" w:lineRule="auto" w:after="120"/>
+        <w:ind w:left="720" w:hanging="720"/>
+        <w:jc w:val="left"/>
+      </w:pPr>
+      <w:r>
+        <w:rPr>
+          <w:rFonts w:ascii="Arial" w:hAnsi="Arial"/>
+          <w:sz w:val="20"/>
+        </w:rPr>
+        <w:t>Google Cloud. (2024). Firebase Documentation: Firestore Realtime Database and Security Rules. Google LLC. https://firebase.google.com/docs/firestore</w:t>
+      </w:r>
+    </w:p>
+    <w:p>
+      <w:pPr>
+        <w:spacing w:line="360" w:lineRule="auto" w:after="120"/>
+        <w:ind w:left="720" w:hanging="720"/>
+        <w:jc w:val="left"/>
+      </w:pPr>
+      <w:r>
+        <w:rPr>
+          <w:rFonts w:ascii="Arial" w:hAnsi="Arial"/>
+          <w:sz w:val="20"/>
+        </w:rPr>
+        <w:t>Huare Inacio, R., et al. (2022). Metodología de la investigación aplicada a la ingeniería de software y sistemas de información. Fondo Editorial Universitario.</w:t>
+      </w:r>
+    </w:p>
+    <w:p>
+      <w:pPr>
+        <w:spacing w:line="360" w:lineRule="auto" w:after="120"/>
+        <w:ind w:left="720" w:hanging="720"/>
+        <w:jc w:val="left"/>
+      </w:pPr>
+      <w:r>
+        <w:rPr>
+          <w:rFonts w:ascii="Arial" w:hAnsi="Arial"/>
+          <w:sz w:val="20"/>
+        </w:rPr>
+        <w:t>Object Management Group. (2017). OMG Unified Modeling Language (OMG UML) Specification, Version 2.5.1. OMG Standard. https://www.omg.org/spec/UML/2.5.1/</w:t>
+      </w:r>
+    </w:p>
+    <w:p>
+      <w:pPr>
+        <w:spacing w:line="360" w:lineRule="auto" w:after="120"/>
+        <w:ind w:left="720" w:hanging="720"/>
+        <w:jc w:val="left"/>
+      </w:pPr>
+      <w:r>
+        <w:rPr>
+          <w:rFonts w:ascii="Arial" w:hAnsi="Arial"/>
+          <w:sz w:val="20"/>
+        </w:rPr>
+        <w:t>Pressman, R. S., &amp; Maxim, B. R. (2020). Software engineering: A practitioner's approach (9th ed.). McGraw-Hill Education.</w:t>
+      </w:r>
+    </w:p>
+    <w:p>
+      <w:pPr>
+        <w:spacing w:line="360" w:lineRule="auto" w:after="120"/>
+        <w:ind w:left="720" w:hanging="720"/>
+        <w:jc w:val="left"/>
+      </w:pPr>
+      <w:r>
+        <w:rPr>
+          <w:rFonts w:ascii="Arial" w:hAnsi="Arial"/>
+          <w:sz w:val="20"/>
+        </w:rPr>
+        <w:t>SheetJS LLC. (2024). SheetJS Community Edition: Spreadsheet Data Processor for JavaScript and TypeScript. https://sheetjs.com/</w:t>
+      </w:r>
+    </w:p>
+    <w:p>
+      <w:pPr>
+        <w:spacing w:line="360" w:lineRule="auto" w:after="120"/>
+        <w:ind w:left="720" w:hanging="720"/>
+        <w:jc w:val="left"/>
+      </w:pPr>
+      <w:r>
+        <w:rPr>
+          <w:rFonts w:ascii="Arial" w:hAnsi="Arial"/>
+          <w:sz w:val="20"/>
+        </w:rPr>
+        <w:t>Sommerville, I. (2016). Software Engineering (10th ed.). Pearson Education.</w:t>
+      </w:r>
+    </w:p>
+    <w:p>
+      <w:pPr>
+        <w:spacing w:line="360" w:lineRule="auto" w:after="120"/>
+        <w:ind w:left="720" w:hanging="720"/>
+        <w:jc w:val="left"/>
+      </w:pPr>
+      <w:r>
+        <w:rPr>
+          <w:rFonts w:ascii="Arial" w:hAnsi="Arial"/>
+          <w:sz w:val="20"/>
+        </w:rPr>
+        <w:t>Vercel. (2024). Next.js 14 Documentation: App Router Architecture, Route Handlers and Edge Runtime. Vercel Inc. https://nextjs.org/docs</w:t>
+      </w:r>
+    </w:p>
     <w:sectPr>
       <w:pgSz w:w="11906" w:h="16838"/>
-      <w:pgMar w:top="1474" w:right="1134" w:bottom="1134" w:left="1701" w:header="1134" w:footer="720" w:gutter="0"/>
+      <w:pgMar w:top="1440" w:right="1440" w:bottom="1440" w:left="1440" w:header="1134" w:footer="720" w:gutter="0"/>
       <w:cols w:space="720"/>
       <w:docGrid w:linePitch="326"/>
     </w:sectPr>
@@ -15796,8 +16296,10 @@
       <w:textAlignment w:val="baseline"/>
     </w:pPr>
     <w:rPr>
+      <w:rFonts w:ascii="Arial" w:hAnsi="Arial"/>
+      <w:color w:val="1E1E1E"/>
       <w:kern w:val="3"/>
-      <w:sz w:val="24"/>
+      <w:sz w:val="22"/>
       <w:szCs w:val="24"/>
       <w:lang w:val="es-ES"/>
     </w:rPr>

</xml_diff>